<commit_message>
Finalised all handouts, ready for submission
</commit_message>
<xml_diff>
--- a/Week 6/Stage_3_Lab_Student_Handout.docx
+++ b/Week 6/Stage_3_Lab_Student_Handout.docx
@@ -66,15 +66,7 @@
     </w:p>
     <w:p>
       <w:r>
-        <w:t xml:space="preserve">Record candidate concepts, supporting requirements, state and </w:t>
-      </w:r>
-      <w:proofErr w:type="spellStart"/>
-      <w:r>
-        <w:t>behaviour</w:t>
-      </w:r>
-      <w:proofErr w:type="spellEnd"/>
-      <w:r>
-        <w:t>.</w:t>
+        <w:t>Record candidate concepts, supporting requirements, state and behaviour.</w:t>
       </w:r>
     </w:p>
     <w:tbl>
@@ -146,17 +138,8 @@
                 <w:b/>
                 <w:bCs/>
               </w:rPr>
-              <w:t>State/</w:t>
+              <w:t>State/Behaviour</w:t>
             </w:r>
-            <w:proofErr w:type="spellStart"/>
-            <w:r>
-              <w:rPr>
-                <w:b/>
-                <w:bCs/>
-              </w:rPr>
-              <w:t>Behaviour</w:t>
-            </w:r>
-            <w:proofErr w:type="spellEnd"/>
           </w:p>
         </w:tc>
         <w:tc>
@@ -458,7 +441,13 @@
         </w:numPr>
       </w:pPr>
       <w:r>
-        <w:t>Store patient information</w:t>
+        <w:t xml:space="preserve">Store </w:t>
+      </w:r>
+      <w:r>
+        <w:t xml:space="preserve">appointment </w:t>
+      </w:r>
+      <w:r>
+        <w:t>information</w:t>
       </w:r>
     </w:p>
     <w:p>
@@ -2200,7 +2189,7 @@
           </mc:Choice>
           <mc:Fallback>
             <w:pict>
-              <v:line w14:anchorId="2D3B9F7A" id="Straight Connector 2" o:spid="_x0000_s1026" style="position:absolute;z-index:251678720;visibility:visible;mso-wrap-style:square;mso-width-percent:0;mso-height-percent:0;mso-wrap-distance-left:9pt;mso-wrap-distance-top:0;mso-wrap-distance-right:9pt;mso-wrap-distance-bottom:0;mso-position-horizontal:absolute;mso-position-horizontal-relative:text;mso-position-vertical:absolute;mso-position-vertical-relative:text;mso-width-percent:0;mso-height-percent:0;mso-width-relative:margin;mso-height-relative:margin" from="350.5pt,12.85pt" to="411.5pt,12.85pt" o:gfxdata="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" strokecolor="black [3200]" strokeweight="2pt">
+              <v:line w14:anchorId="081C5027" id="Straight Connector 2" o:spid="_x0000_s1026" style="position:absolute;z-index:251678720;visibility:visible;mso-wrap-style:square;mso-width-percent:0;mso-height-percent:0;mso-wrap-distance-left:9pt;mso-wrap-distance-top:0;mso-wrap-distance-right:9pt;mso-wrap-distance-bottom:0;mso-position-horizontal:absolute;mso-position-horizontal-relative:text;mso-position-vertical:absolute;mso-position-vertical-relative:text;mso-width-percent:0;mso-height-percent:0;mso-width-relative:margin;mso-height-relative:margin" from="350.5pt,12.85pt" to="411.5pt,12.85pt" o:gfxdata="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" strokecolor="black [3200]" strokeweight="2pt">
                 <v:shadow on="t" color="black" opacity="24903f" origin=",.5" offset="0,.55556mm"/>
               </v:line>
             </w:pict>
@@ -2263,7 +2252,7 @@
           </mc:Choice>
           <mc:Fallback>
             <w:pict>
-              <v:line w14:anchorId="24D244A7" id="Straight Connector 2" o:spid="_x0000_s1026" style="position:absolute;z-index:251678208;visibility:visible;mso-wrap-style:square;mso-wrap-distance-left:9pt;mso-wrap-distance-top:0;mso-wrap-distance-right:9pt;mso-wrap-distance-bottom:0;mso-position-horizontal:absolute;mso-position-horizontal-relative:text;mso-position-vertical:absolute;mso-position-vertical-relative:text" from="140.5pt,11.85pt" to="209pt,12.35pt" o:gfxdata="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" strokecolor="black [3200]" strokeweight="2pt">
+              <v:line w14:anchorId="58DE4646" id="Straight Connector 2" o:spid="_x0000_s1026" style="position:absolute;z-index:251678208;visibility:visible;mso-wrap-style:square;mso-wrap-distance-left:9pt;mso-wrap-distance-top:0;mso-wrap-distance-right:9pt;mso-wrap-distance-bottom:0;mso-position-horizontal:absolute;mso-position-horizontal-relative:text;mso-position-vertical:absolute;mso-position-vertical-relative:text" from="140.5pt,11.85pt" to="209pt,12.35pt" o:gfxdata="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" strokecolor="black [3200]" strokeweight="2pt">
                 <v:shadow on="t" color="black" opacity="24903f" origin=",.5" offset="0,.55556mm"/>
               </v:line>
             </w:pict>
@@ -2867,15 +2856,7 @@
     <w:p/>
     <w:p>
       <w:r>
-        <w:t xml:space="preserve">Suggestion: Add a </w:t>
-      </w:r>
-      <w:proofErr w:type="spellStart"/>
-      <w:r>
-        <w:t>PatientManager</w:t>
-      </w:r>
-      <w:proofErr w:type="spellEnd"/>
-      <w:r>
-        <w:t xml:space="preserve"> class to handle patient-related actions.</w:t>
+        <w:t>Suggestion: Add a PatientManager class to handle patient-related actions.</w:t>
       </w:r>
     </w:p>
     <w:p>
@@ -2890,50 +2871,18 @@
     </w:p>
     <w:p>
       <w:r>
-        <w:t xml:space="preserve">Reason: The patient-related actions are supported by the requirements, but a separate </w:t>
-      </w:r>
-      <w:proofErr w:type="spellStart"/>
-      <w:r>
-        <w:t>PatientManager</w:t>
-      </w:r>
-      <w:proofErr w:type="spellEnd"/>
-      <w:r>
-        <w:t xml:space="preserve"> class would make the model more complicated than it needs to be. These responsibilities can </w:t>
-      </w:r>
-      <w:proofErr w:type="gramStart"/>
-      <w:r>
-        <w:t>stay</w:t>
-      </w:r>
-      <w:proofErr w:type="gramEnd"/>
-      <w:r>
-        <w:t xml:space="preserve"> with the Patient class or the main program logic.</w:t>
+        <w:t>Reason: The patient-related actions are supported by the requirements, but a separate PatientManager class would make the model more complicated than it needs to be. These responsibilities can stay with the Patient class or the main program logic.</w:t>
       </w:r>
     </w:p>
     <w:p>
       <w:r>
-        <w:t xml:space="preserve">Model change: No separate </w:t>
-      </w:r>
-      <w:proofErr w:type="spellStart"/>
-      <w:r>
-        <w:t>PatientManager</w:t>
-      </w:r>
-      <w:proofErr w:type="spellEnd"/>
-      <w:r>
-        <w:t xml:space="preserve"> class added.</w:t>
+        <w:t>Model change: No separate PatientManager class added.</w:t>
       </w:r>
     </w:p>
     <w:p/>
     <w:p>
       <w:r>
-        <w:t xml:space="preserve">Suggestion: Add a </w:t>
-      </w:r>
-      <w:proofErr w:type="spellStart"/>
-      <w:r>
-        <w:t>NotificationManager</w:t>
-      </w:r>
-      <w:proofErr w:type="spellEnd"/>
-      <w:r>
-        <w:t xml:space="preserve"> class to send appointment reminders.</w:t>
+        <w:t>Suggestion: Add a NotificationManager class to send appointment reminders.</w:t>
       </w:r>
     </w:p>
     <w:p>
@@ -2953,15 +2902,7 @@
     </w:p>
     <w:p>
       <w:r>
-        <w:t xml:space="preserve">Model change: No </w:t>
-      </w:r>
-      <w:proofErr w:type="spellStart"/>
-      <w:r>
-        <w:t>NotificationManager</w:t>
-      </w:r>
-      <w:proofErr w:type="spellEnd"/>
-      <w:r>
-        <w:t xml:space="preserve"> class added.</w:t>
+        <w:t>Model change: No NotificationManager class added.</w:t>
       </w:r>
     </w:p>
     <w:p/>
@@ -2970,15 +2911,7 @@
     <w:p>
       <w:r>
         <w:lastRenderedPageBreak/>
-        <w:t xml:space="preserve">Suggestion: Add a </w:t>
-      </w:r>
-      <w:proofErr w:type="spellStart"/>
-      <w:r>
-        <w:t>PractitionerManager</w:t>
-      </w:r>
-      <w:proofErr w:type="spellEnd"/>
-      <w:r>
-        <w:t xml:space="preserve"> class to handle practitioner-related information.</w:t>
+        <w:t>Suggestion: Add a PractitionerManager class to handle practitioner-related information.</w:t>
       </w:r>
     </w:p>
     <w:p>
@@ -2988,29 +2921,13 @@
     </w:p>
     <w:p>
       <w:r>
-        <w:t xml:space="preserve">Reason: The requirement confirms that practitioner information must be stored, but it does not specifically require a separate manager class. The idea is </w:t>
-      </w:r>
-      <w:proofErr w:type="gramStart"/>
-      <w:r>
-        <w:t>possible, but</w:t>
-      </w:r>
-      <w:proofErr w:type="gramEnd"/>
-      <w:r>
-        <w:t xml:space="preserve"> may add unnecessary complexity.</w:t>
+        <w:t>Reason: The requirement confirms that practitioner information must be stored, but it does not specifically require a separate manager class. The idea is possible, but may add unnecessary complexity.</w:t>
       </w:r>
     </w:p>
     <w:p/>
     <w:p>
       <w:r>
-        <w:t xml:space="preserve">Suggestion: Add an </w:t>
-      </w:r>
-      <w:proofErr w:type="spellStart"/>
-      <w:r>
-        <w:t>AppointmentManager</w:t>
-      </w:r>
-      <w:proofErr w:type="spellEnd"/>
-      <w:r>
-        <w:t xml:space="preserve"> class to coordinate appointment-related actions such as status updates and appointment history.</w:t>
+        <w:t>Suggestion: Add an AppointmentManager class to coordinate appointment-related actions such as status updates and appointment history.</w:t>
       </w:r>
     </w:p>
     <w:p>
@@ -3029,15 +2946,7 @@
     <w:p/>
     <w:p>
       <w:r>
-        <w:t xml:space="preserve">Suggestion: Add an </w:t>
-      </w:r>
-      <w:proofErr w:type="spellStart"/>
-      <w:r>
-        <w:t>AppointmentHistory</w:t>
-      </w:r>
-      <w:proofErr w:type="spellEnd"/>
-      <w:r>
-        <w:t xml:space="preserve"> class to store previous appointment records separately.</w:t>
+        <w:t>Suggestion: Add an AppointmentHistory class to store previous appointment records separately.</w:t>
       </w:r>
     </w:p>
     <w:p>
@@ -3069,15 +2978,7 @@
     <w:p/>
     <w:p>
       <w:r>
-        <w:t xml:space="preserve">Suggestion: Add a </w:t>
-      </w:r>
-      <w:proofErr w:type="spellStart"/>
-      <w:r>
-        <w:t>DuplicateBookingChecker</w:t>
-      </w:r>
-      <w:proofErr w:type="spellEnd"/>
-      <w:r>
-        <w:t xml:space="preserve"> class to handle duplicate appointment detection.</w:t>
+        <w:t>Suggestion: Add a DuplicateBookingChecker class to handle duplicate appointment detection.</w:t>
       </w:r>
     </w:p>
     <w:p>
@@ -3087,23 +2988,7 @@
     </w:p>
     <w:p>
       <w:r>
-        <w:t xml:space="preserve">Reason: Duplicate booking detection is </w:t>
-      </w:r>
-      <w:proofErr w:type="gramStart"/>
-      <w:r>
-        <w:t>a confirmed</w:t>
-      </w:r>
-      <w:proofErr w:type="gramEnd"/>
-      <w:r>
-        <w:t xml:space="preserve"> </w:t>
-      </w:r>
-      <w:proofErr w:type="spellStart"/>
-      <w:r>
-        <w:t>behaviour</w:t>
-      </w:r>
-      <w:proofErr w:type="spellEnd"/>
-      <w:r>
-        <w:t>, but the requirement does not justify creating a separate class just for this function.</w:t>
+        <w:t>Reason: Duplicate booking detection is a confirmed behaviour, but the requirement does not justify creating a separate class just for this function.</w:t>
       </w:r>
     </w:p>
     <w:p/>
@@ -3119,15 +3004,7 @@
     </w:p>
     <w:p>
       <w:r>
-        <w:t xml:space="preserve">Reason: The confirmed requirements support both patients and </w:t>
-      </w:r>
-      <w:proofErr w:type="gramStart"/>
-      <w:r>
-        <w:t>practitioner</w:t>
-      </w:r>
-      <w:proofErr w:type="gramEnd"/>
-      <w:r>
-        <w:t xml:space="preserve"> being connected through appointments. A direct Patient-Practitioner relationship is not currently supported by the requirements.</w:t>
+        <w:t>Reason: The confirmed requirements support both patients and practitioner being connected through appointments. A direct Patient-Practitioner relationship is not currently supported by the requirements.</w:t>
       </w:r>
     </w:p>
     <w:p>
@@ -3297,15 +3174,7 @@
           </w:tcPr>
           <w:p>
             <w:r>
-              <w:t xml:space="preserve">These three classes are directly supported by the confirmed SmartCare </w:t>
-            </w:r>
-            <w:proofErr w:type="gramStart"/>
-            <w:r>
-              <w:t>requirements</w:t>
-            </w:r>
-            <w:proofErr w:type="gramEnd"/>
-            <w:r>
-              <w:t xml:space="preserve"> and each represents an important part of the system with its own information and responsibilities.</w:t>
+              <w:t>These three classes are directly supported by the confirmed SmartCare requirements and each represents an important part of the system with its own information and responsibilities.</w:t>
             </w:r>
           </w:p>
         </w:tc>
@@ -3327,15 +3196,7 @@
           </w:tcPr>
           <w:p>
             <w:r>
-              <w:t xml:space="preserve">Add a </w:t>
-            </w:r>
-            <w:proofErr w:type="spellStart"/>
-            <w:r>
-              <w:t>PatientManager</w:t>
-            </w:r>
-            <w:proofErr w:type="spellEnd"/>
-            <w:r>
-              <w:t xml:space="preserve"> class to handle patient-related actions</w:t>
+              <w:t>Add a PatientManager class to handle patient-related actions</w:t>
             </w:r>
           </w:p>
         </w:tc>
@@ -3375,26 +3236,10 @@
           </w:tcPr>
           <w:p>
             <w:r>
-              <w:t xml:space="preserve">No </w:t>
-            </w:r>
-            <w:proofErr w:type="spellStart"/>
-            <w:r>
-              <w:t>PatientManager</w:t>
-            </w:r>
-            <w:proofErr w:type="spellEnd"/>
-            <w:r>
-              <w:t xml:space="preserve"> class was added. The patient-related responsibilities </w:t>
+              <w:t xml:space="preserve">No PatientManager class was added. The patient-related responsibilities </w:t>
             </w:r>
             <w:r>
-              <w:t xml:space="preserve">stayed with </w:t>
-            </w:r>
-            <w:proofErr w:type="gramStart"/>
-            <w:r>
-              <w:t>Patient</w:t>
-            </w:r>
-            <w:proofErr w:type="gramEnd"/>
-            <w:r>
-              <w:t xml:space="preserve"> or the main program logic.</w:t>
+              <w:t>stayed with Patient or the main program logic.</w:t>
             </w:r>
           </w:p>
         </w:tc>
@@ -3406,15 +3251,7 @@
           </w:tcPr>
           <w:p>
             <w:r>
-              <w:t xml:space="preserve">Add a </w:t>
-            </w:r>
-            <w:proofErr w:type="spellStart"/>
-            <w:r>
-              <w:t>NotificationManager</w:t>
-            </w:r>
-            <w:proofErr w:type="spellEnd"/>
-            <w:r>
-              <w:t xml:space="preserve"> class to send appointment reminders</w:t>
+              <w:t>Add a NotificationManager class to send appointment reminders</w:t>
             </w:r>
           </w:p>
         </w:tc>
@@ -3484,15 +3321,7 @@
     </w:p>
     <w:p>
       <w:r>
-        <w:t xml:space="preserve">Check model-code consistency; do not implement full </w:t>
-      </w:r>
-      <w:proofErr w:type="spellStart"/>
-      <w:r>
-        <w:t>behaviour</w:t>
-      </w:r>
-      <w:proofErr w:type="spellEnd"/>
-      <w:r>
-        <w:t xml:space="preserve"> yet.</w:t>
+        <w:t>Check model-code consistency; do not implement full behaviour yet.</w:t>
       </w:r>
     </w:p>
     <w:p>
@@ -3516,15 +3345,7 @@
     </w:p>
     <w:p>
       <w:r>
-        <w:t xml:space="preserve">The Python code only contains class skeletons at this stage, so the methods use pass rather than full implementation. This matches the lab requirement to check model-code consistency without implementing the complete </w:t>
-      </w:r>
-      <w:proofErr w:type="spellStart"/>
-      <w:r>
-        <w:t>behaviour</w:t>
-      </w:r>
-      <w:proofErr w:type="spellEnd"/>
-      <w:r>
-        <w:t xml:space="preserve"> yet.</w:t>
+        <w:t>The Python code only contains class skeletons at this stage, so the methods use pass rather than full implementation. This matches the lab requirement to check model-code consistency without implementing the complete behaviour yet.</w:t>
       </w:r>
     </w:p>
     <w:p>
@@ -3548,23 +3369,7 @@
         <w:t>parts of the activity for me was understanding how classes were meant to be used in th</w:t>
       </w:r>
       <w:r>
-        <w:t xml:space="preserve">e model. Deciding which concepts should become their own </w:t>
-      </w:r>
-      <w:proofErr w:type="gramStart"/>
-      <w:r>
-        <w:t>classes</w:t>
-      </w:r>
-      <w:proofErr w:type="gramEnd"/>
-      <w:r>
-        <w:t xml:space="preserve"> and which should instead be attributes or </w:t>
-      </w:r>
-      <w:proofErr w:type="spellStart"/>
-      <w:r>
-        <w:t>behaviours</w:t>
-      </w:r>
-      <w:proofErr w:type="spellEnd"/>
-      <w:r>
-        <w:t xml:space="preserve"> was initially confusing. The UML diagram was also unfamiliar, particularly understanding how Patient, Practitioner and Appointment</w:t>
+        <w:t>e model. Deciding which concepts should become their own classes and which should instead be attributes or behaviours was initially confusing. The UML diagram was also unfamiliar, particularly understanding how Patient, Practitioner and Appointment</w:t>
       </w:r>
       <w:r>
         <w:t xml:space="preserve"> should be connected and what the multiplicities represented.</w:t>
@@ -3572,52 +3377,12 @@
     </w:p>
     <w:p>
       <w:r>
-        <w:t xml:space="preserve">AI sometimes over-designed the model by suggesting additional classes such as </w:t>
-      </w:r>
-      <w:proofErr w:type="spellStart"/>
-      <w:r>
-        <w:t>PatientManager</w:t>
-      </w:r>
-      <w:proofErr w:type="spellEnd"/>
-      <w:r>
-        <w:t xml:space="preserve">, </w:t>
-      </w:r>
-      <w:proofErr w:type="spellStart"/>
-      <w:r>
-        <w:t>PractitionerManager</w:t>
-      </w:r>
-      <w:proofErr w:type="spellEnd"/>
-      <w:r>
-        <w:t xml:space="preserve">, </w:t>
-      </w:r>
-      <w:proofErr w:type="spellStart"/>
-      <w:r>
-        <w:t>AppointmentManager</w:t>
-      </w:r>
-      <w:proofErr w:type="spellEnd"/>
-      <w:r>
-        <w:t xml:space="preserve"> and </w:t>
-      </w:r>
-      <w:proofErr w:type="spellStart"/>
-      <w:r>
-        <w:t>NotificationManager</w:t>
-      </w:r>
-      <w:proofErr w:type="spellEnd"/>
-      <w:r>
-        <w:t>. Although some of these sounded quite useful at first, they were not directly supported by the confirmed SmartCare requirements and would have made the model more complicated than necessary.</w:t>
+        <w:t>AI sometimes over-designed the model by suggesting additional classes such as PatientManager, PractitionerManager, AppointmentManager and NotificationManager. Although some of these sounded quite useful at first, they were not directly supported by the confirmed SmartCare requirements and would have made the model more complicated than necessary.</w:t>
       </w:r>
     </w:p>
     <w:p>
       <w:r>
-        <w:t xml:space="preserve">The final decisions were mainly based on the requirements </w:t>
-      </w:r>
-      <w:proofErr w:type="gramStart"/>
-      <w:r>
-        <w:t>from</w:t>
-      </w:r>
-      <w:proofErr w:type="gramEnd"/>
-      <w:r>
-        <w:t xml:space="preserve"> SmartCare v0.2. Patient, Practitioner </w:t>
+        <w:t xml:space="preserve">The final decisions were mainly based on the requirements from SmartCare v0.2. Patient, Practitioner </w:t>
       </w:r>
       <w:r>
         <w:t xml:space="preserve">and Appointment were kept as the main classes since they were clearly supported </w:t>

</xml_diff>